<commit_message>
Hermes-Flaechen-Ordnung (Punkte 1+2) + Phase-3-Handoff
- Setup-Doku Section 6: Phase 4 auf Grok + Skills-Ausmist verschlankt
  (Linear raus aus Hermes -> Claude-Code-Build-Achse); Phase 5 um Scout-
  Rolle ergaenzt; Mission Control als Kandidat fuers Buttcoin-Content-
  System vermerkt. .docx neu erzeugt.
- NEXT_SESSION.md: Handoff fuer Phase 3 (Telegram via @BotFather + ffmpeg),
  zwei geparkte Tracks (Linear-Build-Achse, Buttcoin-Content-System) als
  nicht-Phase-3 markiert.

(Entscheidungs-Substanz liegt im Memory ausserhalb des Repos:
project_linear_build_axis, project_hermes_agent Flaechen-Ordnung,
feedback_synthesize_focus_anti_sprawl.)

Co-Authored-By: Claude Opus 4.8 (1M context) <noreply@anthropic.com>
</commit_message>
<xml_diff>
--- a/Hermes/Hermes-Setup Doku 15062026.docx
+++ b/Hermes/Hermes-Setup Doku 15062026.docx
@@ -1590,7 +1590,16 @@
         <w:t>Phase 4 — Werkzeuge:</w:t>
       </w:r>
       <w:r>
-        <w:t xml:space="preserve"> Grok als Tool (X-Trends/Bild), Linear-MCP, Skills/Tools-Ausmist-Pass.</w:t>
+        <w:t xml:space="preserve"> Grok als Tool (X-Trends/Bild) + Skills/Tools-Ausmist-Pass. (</w:t>
+      </w:r>
+      <w:r>
+        <w:rPr>
+          <w:b/>
+        </w:rPr>
+        <w:t>Linear raus aus Hermes</w:t>
+      </w:r>
+      <w:r>
+        <w:t xml:space="preserve"> — gehört zur Claude-Code-Build-Achse, nicht zu Hermes; Entscheid 2026-06-16.)</w:t>
       </w:r>
     </w:p>
     <w:p>
@@ -1604,7 +1613,25 @@
         <w:t>Phase 5 — Autonomie:</w:t>
       </w:r>
       <w:r>
-        <w:t xml:space="preserve"> Morning-Brief-Cron via Reverse-Prompting.</w:t>
+        <w:t xml:space="preserve"> Morning-Brief-Cron via Reverse-Prompting + </w:t>
+      </w:r>
+      <w:r>
+        <w:rPr>
+          <w:b/>
+        </w:rPr>
+        <w:t>Scout-Rolle</w:t>
+      </w:r>
+      <w:r>
+        <w:t xml:space="preserve"> (personalisierte Ideen-/Prototyp-Vorschläge aus Personenkenntnis, Nordstern-gebunden + Triage; graduierte Vorschläge → Linear/PRD → Claude Code). </w:t>
+      </w:r>
+      <w:r>
+        <w:rPr>
+          <w:b/>
+        </w:rPr>
+        <w:t>Mission Control</w:t>
+      </w:r>
+      <w:r>
+        <w:t xml:space="preserve"> nicht jetzt — Kandidat fürs Buttcoin-Content-System („Content-System rund machen"-Track, startet mit Failure-Diagnose der Vorversionen).</w:t>
       </w:r>
     </w:p>
     <w:p>

</xml_diff>

<commit_message>
Hermes Agent Phase 3 (Erreichbarkeit: Telegram + Voice) abgeschlossen + Doku/Memory-Update + Phase-4-Handoff
Co-Authored-By: Claude Opus 4.8 (1M context) <noreply@anthropic.com>
</commit_message>
<xml_diff>
--- a/Hermes/Hermes-Setup Doku 15062026.docx
+++ b/Hermes/Hermes-Setup Doku 15062026.docx
@@ -1573,10 +1573,245 @@
         <w:rPr>
           <w:b/>
         </w:rPr>
-        <w:t>Phase 3 — Erreichbarkeit:</w:t>
-      </w:r>
-      <w:r>
-        <w:t xml:space="preserve"> Telegram via @BotFather. (ffmpeg für Voice-Messages nachinstallieren.)</w:t>
+        <w:t>Phase 3 — Erreichbarkeit: ✅ DONE (06-16).</w:t>
+      </w:r>
+      <w:r>
+        <w:t xml:space="preserve"> Telegram-Bot </w:t>
+      </w:r>
+      <w:r>
+        <w:rPr>
+          <w:rFonts w:ascii="Consolas" w:hAnsi="Consolas"/>
+          <w:color w:val="B03060"/>
+          <w:sz w:val="19"/>
+        </w:rPr>
+        <w:t>@paronthes_hermes_bot</w:t>
+      </w:r>
+      <w:r>
+        <w:t xml:space="preserve"> via @BotFather (</w:t>
+      </w:r>
+      <w:r>
+        <w:rPr>
+          <w:rFonts w:ascii="Consolas" w:hAnsi="Consolas"/>
+          <w:color w:val="B03060"/>
+          <w:sz w:val="19"/>
+        </w:rPr>
+        <w:t>/newbot</w:t>
+      </w:r>
+      <w:r>
+        <w:t xml:space="preserve"> → Name → Username auf </w:t>
+      </w:r>
+      <w:r>
+        <w:rPr>
+          <w:rFonts w:ascii="Consolas" w:hAnsi="Consolas"/>
+          <w:color w:val="B03060"/>
+          <w:sz w:val="19"/>
+        </w:rPr>
+        <w:t>bot</w:t>
+      </w:r>
+      <w:r>
+        <w:t xml:space="preserve"> endend → Token). </w:t>
+      </w:r>
+      <w:r>
+        <w:rPr>
+          <w:rFonts w:ascii="Consolas" w:hAnsi="Consolas"/>
+          <w:color w:val="B03060"/>
+          <w:sz w:val="19"/>
+        </w:rPr>
+        <w:t>hermes gateway setup</w:t>
+      </w:r>
+      <w:r>
+        <w:t xml:space="preserve"> → Telegram + Token + </w:t>
+      </w:r>
+      <w:r>
+        <w:rPr>
+          <w:b/>
+        </w:rPr>
+        <w:t>Allowed-User = eigene numerische Telegram-ID</w:t>
+      </w:r>
+      <w:r>
+        <w:t xml:space="preserve"> (geholt via </w:t>
+      </w:r>
+      <w:r>
+        <w:rPr>
+          <w:b/>
+        </w:rPr>
+        <w:t>@userinfobot</w:t>
+      </w:r>
+      <w:r>
+        <w:t xml:space="preserve">, NICHT über den eigenen Bot!) + </w:t>
+      </w:r>
+      <w:r>
+        <w:rPr>
+          <w:b/>
+        </w:rPr>
+        <w:t>Home-Channel = eigene DM</w:t>
+      </w:r>
+      <w:r>
+        <w:t xml:space="preserve">. </w:t>
+      </w:r>
+      <w:r>
+        <w:rPr>
+          <w:rFonts w:ascii="Consolas" w:hAnsi="Consolas"/>
+          <w:color w:val="B03060"/>
+          <w:sz w:val="19"/>
+        </w:rPr>
+        <w:t>hermes gateway install</w:t>
+      </w:r>
+      <w:r>
+        <w:t xml:space="preserve"> registriert </w:t>
+      </w:r>
+      <w:r>
+        <w:rPr>
+          <w:b/>
+        </w:rPr>
+        <w:t>Scheduled Task `Hermes_Gateway`</w:t>
+      </w:r>
+      <w:r>
+        <w:t xml:space="preserve"> (Auto-Start bei Windows-Login; UAC nur für die Task-Anlage). </w:t>
+      </w:r>
+      <w:r>
+        <w:rPr>
+          <w:b/>
+        </w:rPr>
+        <w:t>Text-GATE</w:t>
+      </w:r>
+      <w:r>
+        <w:t xml:space="preserve"> (hin/zurück) bestanden. </w:t>
+      </w:r>
+      <w:r>
+        <w:rPr>
+          <w:b/>
+        </w:rPr>
+        <w:t>ffmpeg</w:t>
+      </w:r>
+      <w:r>
+        <w:t xml:space="preserve"> für Voice via winget mit </w:t>
+      </w:r>
+      <w:r>
+        <w:rPr>
+          <w:b/>
+        </w:rPr>
+        <w:t>expliziter Paket-ID</w:t>
+      </w:r>
+      <w:r>
+        <w:t xml:space="preserve"> </w:t>
+      </w:r>
+      <w:r>
+        <w:rPr>
+          <w:rFonts w:ascii="Consolas" w:hAnsi="Consolas"/>
+          <w:color w:val="B03060"/>
+          <w:sz w:val="19"/>
+        </w:rPr>
+        <w:t>Gyan.FFmpeg.Essentials -e --accept-source-agreements --accept-package-agreements</w:t>
+      </w:r>
+      <w:r>
+        <w:t xml:space="preserve"> (das generische </w:t>
+      </w:r>
+      <w:r>
+        <w:rPr>
+          <w:rFonts w:ascii="Consolas" w:hAnsi="Consolas"/>
+          <w:color w:val="B03060"/>
+          <w:sz w:val="19"/>
+        </w:rPr>
+        <w:t>winget install ffmpeg</w:t>
+      </w:r>
+      <w:r>
+        <w:t xml:space="preserve"> scheiterte zuvor an Mehrdeutigkeit) → ffmpeg 8.1.1 full-build/gyan.dev mit </w:t>
+      </w:r>
+      <w:r>
+        <w:rPr>
+          <w:rFonts w:ascii="Consolas" w:hAnsi="Consolas"/>
+          <w:color w:val="B03060"/>
+          <w:sz w:val="19"/>
+        </w:rPr>
+        <w:t>libopus</w:t>
+      </w:r>
+      <w:r>
+        <w:t xml:space="preserve">; danach </w:t>
+      </w:r>
+      <w:r>
+        <w:rPr>
+          <w:rFonts w:ascii="Consolas" w:hAnsi="Consolas"/>
+          <w:color w:val="B03060"/>
+          <w:sz w:val="19"/>
+        </w:rPr>
+        <w:t>hermes gateway restart</w:t>
+      </w:r>
+      <w:r>
+        <w:t xml:space="preserve">. </w:t>
+      </w:r>
+      <w:r>
+        <w:rPr>
+          <w:b/>
+        </w:rPr>
+        <w:t>Voice-GATE</w:t>
+      </w:r>
+      <w:r>
+        <w:t xml:space="preserve"> beide Richtungen bestanden (Opus→Text Transkription + TTS→Opus Encoding). </w:t>
+      </w:r>
+      <w:r>
+        <w:rPr>
+          <w:b/>
+        </w:rPr>
+        <w:t>Deutsche Stimme:</w:t>
+      </w:r>
+      <w:r>
+        <w:t xml:space="preserve"> Default war englisch (</w:t>
+      </w:r>
+      <w:r>
+        <w:rPr>
+          <w:rFonts w:ascii="Consolas" w:hAnsi="Consolas"/>
+          <w:color w:val="B03060"/>
+          <w:sz w:val="19"/>
+        </w:rPr>
+        <w:t>en-US-AriaNeural</w:t>
+      </w:r>
+      <w:r>
+        <w:t xml:space="preserve">) → in </w:t>
+      </w:r>
+      <w:r>
+        <w:rPr>
+          <w:rFonts w:ascii="Consolas" w:hAnsi="Consolas"/>
+          <w:color w:val="B03060"/>
+          <w:sz w:val="19"/>
+        </w:rPr>
+        <w:t>C:\Users\manyw\AppData\Local\hermes\config.yaml</w:t>
+      </w:r>
+      <w:r>
+        <w:t xml:space="preserve"> (NICHT </w:t>
+      </w:r>
+      <w:r>
+        <w:rPr>
+          <w:rFonts w:ascii="Consolas" w:hAnsi="Consolas"/>
+          <w:color w:val="B03060"/>
+          <w:sz w:val="19"/>
+        </w:rPr>
+        <w:t>~/.hermes/</w:t>
+      </w:r>
+      <w:r>
+        <w:t xml:space="preserve">!) unter </w:t>
+      </w:r>
+      <w:r>
+        <w:rPr>
+          <w:rFonts w:ascii="Consolas" w:hAnsi="Consolas"/>
+          <w:color w:val="B03060"/>
+          <w:sz w:val="19"/>
+        </w:rPr>
+        <w:t>tts.edge.voice</w:t>
+      </w:r>
+      <w:r>
+        <w:t xml:space="preserve"> auf </w:t>
+      </w:r>
+      <w:r>
+        <w:rPr>
+          <w:rFonts w:ascii="Consolas" w:hAnsi="Consolas"/>
+          <w:color w:val="B03060"/>
+          <w:sz w:val="19"/>
+        </w:rPr>
+        <w:t>de-DE-FlorianMultilingualNeural</w:t>
+      </w:r>
+      <w:r>
+        <w:t xml:space="preserve"> (mehrsprachig, m) geändert + Gateway-Restart.</w:t>
       </w:r>
     </w:p>
     <w:p>
@@ -1758,8 +1993,311 @@
       </w:r>
     </w:p>
     <w:p>
-      <w:r>
-        <w:t>*(Weitere Prompts aus Phase 3–5 werden hier ergänzt, sobald wir sie nutzen.)*</w:t>
+      <w:pPr>
+        <w:pStyle w:val="Heading3"/>
+      </w:pPr>
+      <w:r/>
+      <w:r>
+        <w:t>A.4 Phase 3 — Erreichbarkeit (Telegram + Voice), wiederverwendbare Befehle</w:t>
+      </w:r>
+    </w:p>
+    <w:p>
+      <w:r>
+        <w:rPr>
+          <w:b/>
+        </w:rPr>
+        <w:t>Telegram-Bot anlegen (in der Telegram-App):</w:t>
+      </w:r>
+    </w:p>
+    <w:p>
+      <w:pPr>
+        <w:pStyle w:val="ListNumber"/>
+      </w:pPr>
+      <w:r>
+        <w:rPr>
+          <w:rFonts w:ascii="Consolas" w:hAnsi="Consolas"/>
+          <w:color w:val="B03060"/>
+          <w:sz w:val="19"/>
+        </w:rPr>
+        <w:t>@BotFather</w:t>
+      </w:r>
+      <w:r>
+        <w:t xml:space="preserve"> öffnen → </w:t>
+      </w:r>
+      <w:r>
+        <w:rPr>
+          <w:rFonts w:ascii="Consolas" w:hAnsi="Consolas"/>
+          <w:color w:val="B03060"/>
+          <w:sz w:val="19"/>
+        </w:rPr>
+        <w:t>/newbot</w:t>
+      </w:r>
+      <w:r>
+        <w:t xml:space="preserve"> → Anzeigename → Username (muss auf </w:t>
+      </w:r>
+      <w:r>
+        <w:rPr>
+          <w:rFonts w:ascii="Consolas" w:hAnsi="Consolas"/>
+          <w:color w:val="B03060"/>
+          <w:sz w:val="19"/>
+        </w:rPr>
+        <w:t>bot</w:t>
+      </w:r>
+      <w:r>
+        <w:t xml:space="preserve"> enden) → </w:t>
+      </w:r>
+      <w:r>
+        <w:rPr>
+          <w:b/>
+        </w:rPr>
+        <w:t>Token</w:t>
+      </w:r>
+      <w:r>
+        <w:t xml:space="preserve"> notieren (geheim).</w:t>
+      </w:r>
+    </w:p>
+    <w:p>
+      <w:pPr>
+        <w:pStyle w:val="ListNumber"/>
+      </w:pPr>
+      <w:r>
+        <w:rPr>
+          <w:b/>
+        </w:rPr>
+        <w:t>Eigene numerische User-ID holen:</w:t>
+      </w:r>
+      <w:r>
+        <w:t xml:space="preserve"> </w:t>
+      </w:r>
+      <w:r>
+        <w:rPr>
+          <w:rFonts w:ascii="Consolas" w:hAnsi="Consolas"/>
+          <w:color w:val="B03060"/>
+          <w:sz w:val="19"/>
+        </w:rPr>
+        <w:t>@userinfobot</w:t>
+      </w:r>
+      <w:r>
+        <w:t xml:space="preserve"> anschreiben (</w:t>
+      </w:r>
+      <w:r>
+        <w:rPr>
+          <w:rFonts w:ascii="Consolas" w:hAnsi="Consolas"/>
+          <w:color w:val="B03060"/>
+          <w:sz w:val="19"/>
+        </w:rPr>
+        <w:t>/start</w:t>
+      </w:r>
+      <w:r>
+        <w:t xml:space="preserve">) → er antwortet </w:t>
+      </w:r>
+      <w:r>
+        <w:rPr>
+          <w:rFonts w:ascii="Consolas" w:hAnsi="Consolas"/>
+          <w:color w:val="B03060"/>
+          <w:sz w:val="19"/>
+        </w:rPr>
+        <w:t>Id: 123456789</w:t>
+      </w:r>
+      <w:r>
+        <w:t xml:space="preserve">. (Wichtig: das ist ein </w:t>
+      </w:r>
+      <w:r>
+        <w:rPr>
+          <w:b/>
+        </w:rPr>
+        <w:t>eigener</w:t>
+      </w:r>
+      <w:r>
+        <w:t xml:space="preserve"> Bot — der eigene Hermes-Bot kann die ID nicht liefern.)</w:t>
+      </w:r>
+    </w:p>
+    <w:p>
+      <w:r>
+        <w:rPr>
+          <w:b/>
+        </w:rPr>
+        <w:t>Gateway einrichten + Dauerbetrieb (PowerShell, Home-Verzeichnis):</w:t>
+      </w:r>
+    </w:p>
+    <w:p>
+      <w:pPr>
+        <w:spacing w:after="120"/>
+        <w:ind w:left="240"/>
+      </w:pPr>
+      <w:r>
+        <w:rPr>
+          <w:rFonts w:ascii="Consolas" w:hAnsi="Consolas"/>
+          <w:sz w:val="18"/>
+        </w:rPr>
+        <w:t>hermes gateway setup     # Telegram wählen → Token → Allowed-User = eigene ID → Home-Channel = eigene DM (Y)</w:t>
+        <w:br/>
+        <w:t>hermes gateway run       # Vordergrund-Test (Logs sichtbar); Ctrl+C stoppt</w:t>
+        <w:br/>
+        <w:t>hermes gateway install   # als Scheduled Task 'Hermes_Gateway' (Auto-Start bei Login; UAC bestätigen)</w:t>
+        <w:br/>
+        <w:t>hermes gateway status    # 'running/active' prüfen</w:t>
+        <w:br/>
+        <w:t>hermes gateway restart   # nach Config-Änderungen (liest config.yaml neu ein)</w:t>
+      </w:r>
+    </w:p>
+    <w:p>
+      <w:r>
+        <w:t xml:space="preserve">*Nicht gleichzeitig </w:t>
+      </w:r>
+      <w:r>
+        <w:rPr>
+          <w:rFonts w:ascii="Consolas" w:hAnsi="Consolas"/>
+          <w:color w:val="B03060"/>
+          <w:sz w:val="19"/>
+        </w:rPr>
+        <w:t>run</w:t>
+      </w:r>
+      <w:r>
+        <w:t xml:space="preserve"> (Vordergrund) und den installierten Dienst laufen lassen → Telegram-Conflict (ein Token, ein getUpdates-Consumer).*</w:t>
+      </w:r>
+    </w:p>
+    <w:p>
+      <w:r>
+        <w:rPr>
+          <w:b/>
+        </w:rPr>
+        <w:t>ffmpeg für Voice-Messages (winget, kein Admin nötig):</w:t>
+      </w:r>
+    </w:p>
+    <w:p>
+      <w:pPr>
+        <w:spacing w:after="120"/>
+        <w:ind w:left="240"/>
+      </w:pPr>
+      <w:r>
+        <w:rPr>
+          <w:rFonts w:ascii="Consolas" w:hAnsi="Consolas"/>
+          <w:sz w:val="18"/>
+        </w:rPr>
+        <w:t>winget install --id Gyan.FFmpeg.Essentials -e --accept-source-agreements --accept-package-agreements</w:t>
+        <w:br/>
+        <w:t># danach NEUES Fenster: ffmpeg -version  →  dann: hermes gateway restart</w:t>
+      </w:r>
+    </w:p>
+    <w:p>
+      <w:r>
+        <w:t xml:space="preserve">*Explizite </w:t>
+      </w:r>
+      <w:r>
+        <w:rPr>
+          <w:rFonts w:ascii="Consolas" w:hAnsi="Consolas"/>
+          <w:color w:val="B03060"/>
+          <w:sz w:val="19"/>
+        </w:rPr>
+        <w:t>--id</w:t>
+      </w:r>
+      <w:r>
+        <w:t xml:space="preserve"> nutzen — </w:t>
+      </w:r>
+      <w:r>
+        <w:rPr>
+          <w:rFonts w:ascii="Consolas" w:hAnsi="Consolas"/>
+          <w:color w:val="B03060"/>
+          <w:sz w:val="19"/>
+        </w:rPr>
+        <w:t>winget install ffmpeg</w:t>
+      </w:r>
+      <w:r>
+        <w:t xml:space="preserve"> bricht an Mehrdeutigkeit ab.*</w:t>
+      </w:r>
+    </w:p>
+    <w:p>
+      <w:r>
+        <w:rPr>
+          <w:b/>
+        </w:rPr>
+        <w:t>Deutsche TTS-Stimme setzen</w:t>
+      </w:r>
+      <w:r>
+        <w:t xml:space="preserve"> (Config: </w:t>
+      </w:r>
+      <w:r>
+        <w:rPr>
+          <w:rFonts w:ascii="Consolas" w:hAnsi="Consolas"/>
+          <w:color w:val="B03060"/>
+          <w:sz w:val="19"/>
+        </w:rPr>
+        <w:t>C:\Users\manyw\AppData\Local\hermes\config.yaml</w:t>
+      </w:r>
+      <w:r>
+        <w:t xml:space="preserve">, </w:t>
+      </w:r>
+      <w:r>
+        <w:rPr>
+          <w:b/>
+        </w:rPr>
+        <w:t>nicht</w:t>
+      </w:r>
+      <w:r>
+        <w:t xml:space="preserve"> </w:t>
+      </w:r>
+      <w:r>
+        <w:rPr>
+          <w:rFonts w:ascii="Consolas" w:hAnsi="Consolas"/>
+          <w:color w:val="B03060"/>
+          <w:sz w:val="19"/>
+        </w:rPr>
+        <w:t>~/.hermes/</w:t>
+      </w:r>
+      <w:r>
+        <w:t>):</w:t>
+      </w:r>
+    </w:p>
+    <w:p>
+      <w:pPr>
+        <w:spacing w:after="120"/>
+        <w:ind w:left="240"/>
+      </w:pPr>
+      <w:r>
+        <w:rPr>
+          <w:rFonts w:ascii="Consolas" w:hAnsi="Consolas"/>
+          <w:sz w:val="18"/>
+        </w:rPr>
+        <w:t>tts:</w:t>
+        <w:br/>
+        <w:t xml:space="preserve">  provider: edge</w:t>
+        <w:br/>
+        <w:t xml:space="preserve">  edge:</w:t>
+        <w:br/>
+        <w:t xml:space="preserve">    voice: de-DE-FlorianMultilingualNeural   # m, mehrsprachig (DE + eingebettetes EN); Alt.: de-DE-SeraphinaMultilingualNeural (w), de-DE-ConradNeural (m), de-DE-KatjaNeural (w)</w:t>
+      </w:r>
+    </w:p>
+    <w:p>
+      <w:r>
+        <w:t xml:space="preserve">*Edit speichern → </w:t>
+      </w:r>
+      <w:r>
+        <w:rPr>
+          <w:rFonts w:ascii="Consolas" w:hAnsi="Consolas"/>
+          <w:color w:val="B03060"/>
+          <w:sz w:val="19"/>
+        </w:rPr>
+        <w:t>hermes gateway restart</w:t>
+      </w:r>
+      <w:r>
+        <w:t xml:space="preserve">. Backup der Config liegt als </w:t>
+      </w:r>
+      <w:r>
+        <w:rPr>
+          <w:rFonts w:ascii="Consolas" w:hAnsi="Consolas"/>
+          <w:color w:val="B03060"/>
+          <w:sz w:val="19"/>
+        </w:rPr>
+        <w:t>config.yaml.bak.*</w:t>
+      </w:r>
+      <w:r>
+        <w:t xml:space="preserve"> daneben.*</w:t>
+      </w:r>
+    </w:p>
+    <w:p>
+      <w:r>
+        <w:t>*(Weitere Prompts aus Phase 4–5 werden hier ergänzt, sobald wir sie nutzen.)*</w:t>
       </w:r>
     </w:p>
     <w:p>

</xml_diff>

<commit_message>
Hermes Agent Phase 4 (Werkzeuge: Grok-Tool + Skills-Ausmist) DONE + Auto-TTS-Self-Patch gesichert
- Phase 4 A: Grok als Tool via 'hermes auth add xai-oauth' + x_search (live verifiziert, X-Trend-Scan); video_gen wieder aus, Bild-Gen bleibt openai-codex
- Phase 4 C: Skills-Ausmist 63->37 enabled via skills.disabled-Batch (Skills-Index 7,1->4,0 KB; +x_search Tool-Schema)
- Phase 4 B: Desktop-App geparkt (Source-Build 'hermes desktop' scheitert an node-24-Drift + Electron-Download-fetch; prebuilt .exe noch offen)
- Nebenereignis: Hermes hat seinen Auto-TTS-Bug selbst gepatcht (7 Dateien hermes-agent-Source, 177 Tests gruen, Self-Restart) -> Patch gesichert Hermes/hermes_autotts_selffix_20260616.patch (Upstream-Divergenz)
- Doku: Phase 4 DONE + Anhang A.5 (Phase-4-Befehle) + Lessons; NEXT_SESSION -> Phase 5

Co-Authored-By: Claude Opus 4.8 (1M context) <noreply@anthropic.com>
</commit_message>
<xml_diff>
--- a/Hermes/Hermes-Setup Doku 15062026.docx
+++ b/Hermes/Hermes-Setup Doku 15062026.docx
@@ -1249,6 +1249,191 @@
       </w:r>
     </w:p>
     <w:p>
+      <w:pPr>
+        <w:pStyle w:val="ListBullet"/>
+      </w:pPr>
+      <w:r>
+        <w:rPr>
+          <w:b/>
+        </w:rPr>
+        <w:t>Hermes patcht auf „Kannst du das fixen?" seinen EIGENEN Quellcode</w:t>
+      </w:r>
+      <w:r>
+        <w:t xml:space="preserve"> (06-16-Erfahrung mit dem Auto-TTS-Bug): methodisch (Code + Regressionstests + </w:t>
+      </w:r>
+      <w:r>
+        <w:rPr>
+          <w:rFonts w:ascii="Consolas" w:hAnsi="Consolas"/>
+          <w:color w:val="B03060"/>
+          <w:sz w:val="19"/>
+        </w:rPr>
+        <w:t>pytest</w:t>
+      </w:r>
+      <w:r>
+        <w:t>/</w:t>
+      </w:r>
+      <w:r>
+        <w:rPr>
+          <w:rFonts w:ascii="Consolas" w:hAnsi="Consolas"/>
+          <w:color w:val="B03060"/>
+          <w:sz w:val="19"/>
+        </w:rPr>
+        <w:t>py_compile</w:t>
+      </w:r>
+      <w:r>
+        <w:t xml:space="preserve">), aber es entsteht </w:t>
+      </w:r>
+      <w:r>
+        <w:rPr>
+          <w:b/>
+        </w:rPr>
+        <w:t>lokale Divergenz vom Nous-Upstream</w:t>
+      </w:r>
+      <w:r>
+        <w:t xml:space="preserve"> im </w:t>
+      </w:r>
+      <w:r>
+        <w:rPr>
+          <w:rFonts w:ascii="Consolas" w:hAnsi="Consolas"/>
+          <w:color w:val="B03060"/>
+          <w:sz w:val="19"/>
+        </w:rPr>
+        <w:t>…\hermes-agent\</w:t>
+      </w:r>
+      <w:r>
+        <w:t xml:space="preserve">-Repo. </w:t>
+      </w:r>
+      <w:r>
+        <w:rPr>
+          <w:b/>
+        </w:rPr>
+        <w:t>Gut zu wissen:</w:t>
+      </w:r>
+      <w:r>
+        <w:t xml:space="preserve"> (a) Patches werden erst beim nächsten Gateway-Restart scharf — vorher mit </w:t>
+      </w:r>
+      <w:r>
+        <w:rPr>
+          <w:rFonts w:ascii="Consolas" w:hAnsi="Consolas"/>
+          <w:color w:val="B03060"/>
+          <w:sz w:val="19"/>
+        </w:rPr>
+        <w:t>git -C …\hermes-agent diff</w:t>
+      </w:r>
+      <w:r>
+        <w:t xml:space="preserve"> reviewen; (b) Hermes kann den „Refusing to restart"-Schutz via *verzögertem* Restart umgehen und sich selbst neu starten; (c) jeden Selbst-Fix als </w:t>
+      </w:r>
+      <w:r>
+        <w:rPr>
+          <w:rFonts w:ascii="Consolas" w:hAnsi="Consolas"/>
+          <w:color w:val="B03060"/>
+          <w:sz w:val="19"/>
+        </w:rPr>
+        <w:t>.patch</w:t>
+      </w:r>
+      <w:r>
+        <w:t xml:space="preserve"> sichern (</w:t>
+      </w:r>
+      <w:r>
+        <w:rPr>
+          <w:rFonts w:ascii="Consolas" w:hAnsi="Consolas"/>
+          <w:color w:val="B03060"/>
+          <w:sz w:val="19"/>
+        </w:rPr>
+        <w:t>git diff --output=…</w:t>
+      </w:r>
+      <w:r>
+        <w:t xml:space="preserve">) + in </w:t>
+      </w:r>
+      <w:r>
+        <w:rPr>
+          <w:rFonts w:ascii="Consolas" w:hAnsi="Consolas"/>
+          <w:color w:val="B03060"/>
+          <w:sz w:val="19"/>
+        </w:rPr>
+        <w:t>ClaudeCodeZero\Hermes\</w:t>
+      </w:r>
+      <w:r>
+        <w:t xml:space="preserve"> ablegen, sonst geht er bei </w:t>
+      </w:r>
+      <w:r>
+        <w:rPr>
+          <w:rFonts w:ascii="Consolas" w:hAnsi="Consolas"/>
+          <w:color w:val="B03060"/>
+          <w:sz w:val="19"/>
+        </w:rPr>
+        <w:t>hermes update</w:t>
+      </w:r>
+      <w:r>
+        <w:t xml:space="preserve"> („Restore local changes? n") verloren. Verwerfen: </w:t>
+      </w:r>
+      <w:r>
+        <w:rPr>
+          <w:rFonts w:ascii="Consolas" w:hAnsi="Consolas"/>
+          <w:color w:val="B03060"/>
+          <w:sz w:val="19"/>
+        </w:rPr>
+        <w:t>git -C …\hermes-agent checkout -- .</w:t>
+      </w:r>
+      <w:r>
+        <w:t>.</w:t>
+      </w:r>
+    </w:p>
+    <w:p>
+      <w:pPr>
+        <w:pStyle w:val="ListBullet"/>
+      </w:pPr>
+      <w:r>
+        <w:rPr>
+          <w:b/>
+        </w:rPr>
+        <w:t>Desktop-GUI bleibt die fragile Ecke</w:t>
+      </w:r>
+      <w:r>
+        <w:t xml:space="preserve"> (2. Anlauf 06-16): jetzt nicht mehr </w:t>
+      </w:r>
+      <w:r>
+        <w:rPr>
+          <w:rFonts w:ascii="Consolas" w:hAnsi="Consolas"/>
+          <w:color w:val="B03060"/>
+          <w:sz w:val="19"/>
+        </w:rPr>
+        <w:t>@assistant-ui/tap</w:t>
+      </w:r>
+      <w:r>
+        <w:t xml:space="preserve">, sondern </w:t>
+      </w:r>
+      <w:r>
+        <w:rPr>
+          <w:b/>
+        </w:rPr>
+        <w:t>Electron-Download `fetch failed`</w:t>
+      </w:r>
+      <w:r>
+        <w:t xml:space="preserve"> (AV/EDR-SSL-Interception) </w:t>
+      </w:r>
+      <w:r>
+        <w:rPr>
+          <w:b/>
+        </w:rPr>
+        <w:t>+ node-22-vs-24-Drift</w:t>
+      </w:r>
+      <w:r>
+        <w:t xml:space="preserve">. Die App ist für Hermes' Funktion nicht nötig (CLI + Telegram + Gateway sind der Workhorse) — sauberer Bau-Versuch erst nach </w:t>
+      </w:r>
+      <w:r>
+        <w:rPr>
+          <w:rFonts w:ascii="Consolas" w:hAnsi="Consolas"/>
+          <w:color w:val="B03060"/>
+          <w:sz w:val="19"/>
+        </w:rPr>
+        <w:t>hermes update</w:t>
+      </w:r>
+      <w:r>
+        <w:t xml:space="preserve"> auf node-24-Basis.</w:t>
+      </w:r>
+    </w:p>
+    <w:p>
       <w:r>
         <w:rPr>
           <w:color w:val="BBBBBB"/>
@@ -1822,19 +2007,7 @@
         <w:rPr>
           <w:b/>
         </w:rPr>
-        <w:t>Phase 4 — Werkzeuge:</w:t>
-      </w:r>
-      <w:r>
-        <w:t xml:space="preserve"> Grok als Tool (X-Trends/Bild) + Skills/Tools-Ausmist-Pass. (</w:t>
-      </w:r>
-      <w:r>
-        <w:rPr>
-          <w:b/>
-        </w:rPr>
-        <w:t>Linear raus aus Hermes</w:t>
-      </w:r>
-      <w:r>
-        <w:t xml:space="preserve"> — gehört zur Claude-Code-Build-Achse, nicht zu Hermes; Entscheid 2026-06-16.)</w:t>
+        <w:t>Phase 4 — Werkzeuge: ✅ DONE (06-16).</w:t>
       </w:r>
     </w:p>
     <w:p>
@@ -1845,6 +2018,551 @@
         <w:rPr>
           <w:b/>
         </w:rPr>
+        <w:t>(A) Grok als Tool:</w:t>
+      </w:r>
+      <w:r>
+        <w:t xml:space="preserve"> </w:t>
+      </w:r>
+      <w:r>
+        <w:rPr>
+          <w:rFonts w:ascii="Consolas" w:hAnsi="Consolas"/>
+          <w:color w:val="B03060"/>
+          <w:sz w:val="19"/>
+        </w:rPr>
+        <w:t>hermes auth add xai-oauth</w:t>
+      </w:r>
+      <w:r>
+        <w:t xml:space="preserve"> (PKCE-Loopback-OAuth, setzt </w:t>
+      </w:r>
+      <w:r>
+        <w:rPr>
+          <w:b/>
+        </w:rPr>
+        <w:t>SuperGrok / X-Premium+</w:t>
+      </w:r>
+      <w:r>
+        <w:t xml:space="preserve"> voraus; </w:t>
+      </w:r>
+      <w:r>
+        <w:rPr>
+          <w:b/>
+        </w:rPr>
+        <w:t>kein</w:t>
+      </w:r>
+      <w:r>
+        <w:t xml:space="preserve"> Modellwechsel — GPT-5.5 bleibt Orchestrator, daher </w:t>
+      </w:r>
+      <w:r>
+        <w:rPr>
+          <w:rFonts w:ascii="Consolas" w:hAnsi="Consolas"/>
+          <w:color w:val="B03060"/>
+          <w:sz w:val="19"/>
+        </w:rPr>
+        <w:t>auth add</w:t>
+      </w:r>
+      <w:r>
+        <w:t xml:space="preserve"> statt </w:t>
+      </w:r>
+      <w:r>
+        <w:rPr>
+          <w:rFonts w:ascii="Consolas" w:hAnsi="Consolas"/>
+          <w:color w:val="B03060"/>
+          <w:sz w:val="19"/>
+        </w:rPr>
+        <w:t>hermes model</w:t>
+      </w:r>
+      <w:r>
+        <w:t xml:space="preserve">) → </w:t>
+      </w:r>
+      <w:r>
+        <w:rPr>
+          <w:rFonts w:ascii="Consolas" w:hAnsi="Consolas"/>
+          <w:color w:val="B03060"/>
+          <w:sz w:val="19"/>
+        </w:rPr>
+        <w:t>hermes tools enable x_search</w:t>
+      </w:r>
+      <w:r>
+        <w:t xml:space="preserve">. </w:t>
+      </w:r>
+      <w:r>
+        <w:rPr>
+          <w:b/>
+        </w:rPr>
+        <w:t>Live verifiziert:</w:t>
+      </w:r>
+      <w:r>
+        <w:t xml:space="preserve"> X-Trend-Scan über Telegram liefert echte X-Status-Links. </w:t>
+      </w:r>
+      <w:r>
+        <w:rPr>
+          <w:rFonts w:ascii="Consolas" w:hAnsi="Consolas"/>
+          <w:color w:val="B03060"/>
+          <w:sz w:val="19"/>
+        </w:rPr>
+        <w:t>video_gen</w:t>
+      </w:r>
+      <w:r>
+        <w:t xml:space="preserve"> testweise aktiviert, mangels Provider + akutem Bedarf wieder </w:t>
+      </w:r>
+      <w:r>
+        <w:rPr>
+          <w:rFonts w:ascii="Consolas" w:hAnsi="Consolas"/>
+          <w:color w:val="B03060"/>
+          <w:sz w:val="19"/>
+        </w:rPr>
+        <w:t>disable</w:t>
+      </w:r>
+      <w:r>
+        <w:t xml:space="preserve">d; Bild-Gen bleibt unverändert bei </w:t>
+      </w:r>
+      <w:r>
+        <w:rPr>
+          <w:rFonts w:ascii="Consolas" w:hAnsi="Consolas"/>
+          <w:color w:val="B03060"/>
+          <w:sz w:val="19"/>
+        </w:rPr>
+        <w:t>openai-codex</w:t>
+      </w:r>
+      <w:r>
+        <w:t>/</w:t>
+      </w:r>
+      <w:r>
+        <w:rPr>
+          <w:rFonts w:ascii="Consolas" w:hAnsi="Consolas"/>
+          <w:color w:val="B03060"/>
+          <w:sz w:val="19"/>
+        </w:rPr>
+        <w:t>gpt-image-2-medium</w:t>
+      </w:r>
+      <w:r>
+        <w:t xml:space="preserve">. (Hinweis: </w:t>
+      </w:r>
+      <w:r>
+        <w:rPr>
+          <w:rFonts w:ascii="Consolas" w:hAnsi="Consolas"/>
+          <w:color w:val="B03060"/>
+          <w:sz w:val="19"/>
+        </w:rPr>
+        <w:t>hermes login</w:t>
+      </w:r>
+      <w:r>
+        <w:t xml:space="preserve"> ist in v0.16.0 entfernt → </w:t>
+      </w:r>
+      <w:r>
+        <w:rPr>
+          <w:rFonts w:ascii="Consolas" w:hAnsi="Consolas"/>
+          <w:color w:val="B03060"/>
+          <w:sz w:val="19"/>
+        </w:rPr>
+        <w:t>hermes auth add</w:t>
+      </w:r>
+      <w:r>
+        <w:t xml:space="preserve"> nutzen.)</w:t>
+      </w:r>
+    </w:p>
+    <w:p>
+      <w:pPr>
+        <w:pStyle w:val="ListBullet"/>
+      </w:pPr>
+      <w:r>
+        <w:rPr>
+          <w:b/>
+        </w:rPr>
+        <w:t>(B) Desktop-App: ⏸️ GEPARKT</w:t>
+      </w:r>
+      <w:r>
+        <w:t xml:space="preserve"> — </w:t>
+      </w:r>
+      <w:r>
+        <w:rPr>
+          <w:rFonts w:ascii="Consolas" w:hAnsi="Consolas"/>
+          <w:color w:val="B03060"/>
+          <w:sz w:val="19"/>
+        </w:rPr>
+        <w:t>hermes desktop --build-only</w:t>
+      </w:r>
+      <w:r>
+        <w:t xml:space="preserve"> scheitert an (1) Electron-Binary-Download (</w:t>
+      </w:r>
+      <w:r>
+        <w:rPr>
+          <w:rFonts w:ascii="Consolas" w:hAnsi="Consolas"/>
+          <w:color w:val="B03060"/>
+          <w:sz w:val="19"/>
+        </w:rPr>
+        <w:t>@electron/get</w:t>
+      </w:r>
+      <w:r>
+        <w:t xml:space="preserve"> → </w:t>
+      </w:r>
+      <w:r>
+        <w:rPr>
+          <w:rFonts w:ascii="Consolas" w:hAnsi="Consolas"/>
+          <w:color w:val="B03060"/>
+          <w:sz w:val="19"/>
+        </w:rPr>
+        <w:t>fetch failed</w:t>
+      </w:r>
+      <w:r>
+        <w:t xml:space="preserve">, vermutlich AV/EDR-SSL-Interception wie bei RSS/YT) </w:t>
+      </w:r>
+      <w:r>
+        <w:rPr>
+          <w:b/>
+        </w:rPr>
+        <w:t>und</w:t>
+      </w:r>
+      <w:r>
+        <w:t xml:space="preserve"> (2) node-22-vs-24-Drift (Desktop-Code verlangt node≥24, Hermes bündelt v22). Für „wenn Platz"-Bonus nicht den Eingriff wert. </w:t>
+      </w:r>
+      <w:r>
+        <w:rPr>
+          <w:b/>
+        </w:rPr>
+        <w:t>Wichtig:</w:t>
+      </w:r>
+      <w:r>
+        <w:t xml:space="preserve"> Der Source-Build (</w:t>
+      </w:r>
+      <w:r>
+        <w:rPr>
+          <w:rFonts w:ascii="Consolas" w:hAnsi="Consolas"/>
+          <w:color w:val="B03060"/>
+          <w:sz w:val="19"/>
+        </w:rPr>
+        <w:t>hermes desktop</w:t>
+      </w:r>
+      <w:r>
+        <w:t xml:space="preserve">) ist NICHT der einzige Weg — laut früherer Recherche gibt es einen </w:t>
+      </w:r>
+      <w:r>
+        <w:rPr>
+          <w:b/>
+        </w:rPr>
+        <w:t>prebuilt `.exe`-Installer</w:t>
+      </w:r>
+      <w:r>
+        <w:t xml:space="preserve"> (Docs </w:t>
+      </w:r>
+      <w:r>
+        <w:rPr>
+          <w:rFonts w:ascii="Consolas" w:hAnsi="Consolas"/>
+          <w:color w:val="B03060"/>
+          <w:sz w:val="19"/>
+        </w:rPr>
+        <w:t>…/windows-native</w:t>
+      </w:r>
+      <w:r>
+        <w:t xml:space="preserve">), der den node/Electron-Source-Build umgeht = der noch-nicht-probierte, vielversprechendere Pfad. Alternativ vorher </w:t>
+      </w:r>
+      <w:r>
+        <w:rPr>
+          <w:rFonts w:ascii="Consolas" w:hAnsi="Consolas"/>
+          <w:color w:val="B03060"/>
+          <w:sz w:val="19"/>
+        </w:rPr>
+        <w:t>hermes update</w:t>
+      </w:r>
+      <w:r>
+        <w:t xml:space="preserve"> (node-24 + aktueller Code, </w:t>
+      </w:r>
+      <w:r>
+        <w:rPr>
+          <w:rFonts w:ascii="Consolas" w:hAnsi="Consolas"/>
+          <w:color w:val="B03060"/>
+          <w:sz w:val="19"/>
+        </w:rPr>
+        <w:t>hermes backup</w:t>
+      </w:r>
+      <w:r>
+        <w:t xml:space="preserve"> davor) + SSL-Bypass + Gateway-Stop gegen EBUSY-Locks. Als </w:t>
+      </w:r>
+      <w:r>
+        <w:rPr>
+          <w:b/>
+        </w:rPr>
+        <w:t>optionaler Auftakt von Phase 5</w:t>
+      </w:r>
+      <w:r>
+        <w:t xml:space="preserve"> vorgemerkt.</w:t>
+      </w:r>
+    </w:p>
+    <w:p>
+      <w:pPr>
+        <w:pStyle w:val="ListBullet"/>
+      </w:pPr>
+      <w:r>
+        <w:rPr>
+          <w:b/>
+        </w:rPr>
+        <w:t>(C) Skills-Ausmist:</w:t>
+      </w:r>
+      <w:r>
+        <w:t xml:space="preserve"> 63 → </w:t>
+      </w:r>
+      <w:r>
+        <w:rPr>
+          <w:b/>
+        </w:rPr>
+        <w:t>37 enabled / 26 disabled</w:t>
+      </w:r>
+      <w:r>
+        <w:t xml:space="preserve"> via </w:t>
+      </w:r>
+      <w:r>
+        <w:rPr>
+          <w:rFonts w:ascii="Consolas" w:hAnsi="Consolas"/>
+          <w:color w:val="B03060"/>
+          <w:sz w:val="19"/>
+        </w:rPr>
+        <w:t>skills.disabled</w:t>
+      </w:r>
+      <w:r>
+        <w:t xml:space="preserve">-Liste in config.yaml (Batch über Hermes' eigene </w:t>
+      </w:r>
+      <w:r>
+        <w:rPr>
+          <w:rFonts w:ascii="Consolas" w:hAnsi="Consolas"/>
+          <w:color w:val="B03060"/>
+          <w:sz w:val="19"/>
+        </w:rPr>
+        <w:t>save_disabled_skills</w:t>
+      </w:r>
+      <w:r>
+        <w:t xml:space="preserve">-API; Backup </w:t>
+      </w:r>
+      <w:r>
+        <w:rPr>
+          <w:rFonts w:ascii="Consolas" w:hAnsi="Consolas"/>
+          <w:color w:val="B03060"/>
+          <w:sz w:val="19"/>
+        </w:rPr>
+        <w:t>config.yaml.bak.ausmist_*</w:t>
+      </w:r>
+      <w:r>
+        <w:t xml:space="preserve">, 1 Zeile reversibel). Deaktiviert: Musik/Audio + Bild/CV/VJ + ML-Training/Ops + Fremd-Ökosysteme (yuanbao/openhue/himalaya/airtable/teams/polymarket/maps) + 4 Design (excalidraw/sketch/notion/powerpoint). Skills-Index im System-Prompt 7,1 → </w:t>
+      </w:r>
+      <w:r>
+        <w:rPr>
+          <w:b/>
+        </w:rPr>
+        <w:t>4,0 KB</w:t>
+      </w:r>
+      <w:r>
+        <w:t xml:space="preserve"> (−42 %); Tool-Schemas +4 KB durch </w:t>
+      </w:r>
+      <w:r>
+        <w:rPr>
+          <w:rFonts w:ascii="Consolas" w:hAnsi="Consolas"/>
+          <w:color w:val="B03060"/>
+          <w:sz w:val="19"/>
+        </w:rPr>
+        <w:t>x_search</w:t>
+      </w:r>
+      <w:r>
+        <w:t xml:space="preserve"> → netto sinnvoller belegt statt totes Rauschen.</w:t>
+      </w:r>
+    </w:p>
+    <w:p>
+      <w:pPr>
+        <w:pStyle w:val="ListBullet"/>
+      </w:pPr>
+      <w:r>
+        <w:rPr>
+          <w:b/>
+        </w:rPr>
+        <w:t>Nebenereignis 06-16 — Hermes hat seinen eigenen Auto-TTS-Bug selbst gefixt:</w:t>
+      </w:r>
+      <w:r>
+        <w:t xml:space="preserve"> Auf „Kannst du das fixen?" hin </w:t>
+      </w:r>
+      <w:r>
+        <w:rPr>
+          <w:b/>
+        </w:rPr>
+        <w:t>7 Dateien im `hermes-agent`-Source gepatcht</w:t>
+      </w:r>
+      <w:r>
+        <w:t xml:space="preserve"> (</w:t>
+      </w:r>
+      <w:r>
+        <w:rPr>
+          <w:rFonts w:ascii="Consolas" w:hAnsi="Consolas"/>
+          <w:color w:val="B03060"/>
+          <w:sz w:val="19"/>
+        </w:rPr>
+        <w:t>gateway/platforms/base.py</w:t>
+      </w:r>
+      <w:r>
+        <w:t>+</w:t>
+      </w:r>
+      <w:r>
+        <w:rPr>
+          <w:rFonts w:ascii="Consolas" w:hAnsi="Consolas"/>
+          <w:color w:val="B03060"/>
+          <w:sz w:val="19"/>
+        </w:rPr>
+        <w:t>run.py</w:t>
+      </w:r>
+      <w:r>
+        <w:t>+</w:t>
+      </w:r>
+      <w:r>
+        <w:rPr>
+          <w:rFonts w:ascii="Consolas" w:hAnsi="Consolas"/>
+          <w:color w:val="B03060"/>
+          <w:sz w:val="19"/>
+        </w:rPr>
+        <w:t>slash_commands.py</w:t>
+      </w:r>
+      <w:r>
+        <w:t xml:space="preserve"> + 4 Test-Dateien, 125+/18−), </w:t>
+      </w:r>
+      <w:r>
+        <w:rPr>
+          <w:rFonts w:ascii="Consolas" w:hAnsi="Consolas"/>
+          <w:color w:val="B03060"/>
+          <w:sz w:val="19"/>
+        </w:rPr>
+        <w:t>/voice on</w:t>
+      </w:r>
+      <w:r>
+        <w:t xml:space="preserve"> (Voice→Voice) vs </w:t>
+      </w:r>
+      <w:r>
+        <w:rPr>
+          <w:rFonts w:ascii="Consolas" w:hAnsi="Consolas"/>
+          <w:color w:val="B03060"/>
+          <w:sz w:val="19"/>
+        </w:rPr>
+        <w:t>/voice tts</w:t>
+      </w:r>
+      <w:r>
+        <w:t xml:space="preserve"> (auch Text→Sprache) vs </w:t>
+      </w:r>
+      <w:r>
+        <w:rPr>
+          <w:rFonts w:ascii="Consolas" w:hAnsi="Consolas"/>
+          <w:color w:val="B03060"/>
+          <w:sz w:val="19"/>
+        </w:rPr>
+        <w:t>/voice off</w:t>
+      </w:r>
+      <w:r>
+        <w:t xml:space="preserve"> sauber getrennt, </w:t>
+      </w:r>
+      <w:r>
+        <w:rPr>
+          <w:b/>
+        </w:rPr>
+        <w:t>`177 passed / 21 skipped`</w:t>
+      </w:r>
+      <w:r>
+        <w:t xml:space="preserve"> + </w:t>
+      </w:r>
+      <w:r>
+        <w:rPr>
+          <w:rFonts w:ascii="Consolas" w:hAnsi="Consolas"/>
+          <w:color w:val="B03060"/>
+          <w:sz w:val="19"/>
+        </w:rPr>
+        <w:t>py_compile</w:t>
+      </w:r>
+      <w:r>
+        <w:t>/</w:t>
+      </w:r>
+      <w:r>
+        <w:rPr>
+          <w:rFonts w:ascii="Consolas" w:hAnsi="Consolas"/>
+          <w:color w:val="B03060"/>
+          <w:sz w:val="19"/>
+        </w:rPr>
+        <w:t>git diff --check</w:t>
+      </w:r>
+      <w:r>
+        <w:t xml:space="preserve"> sauber, dann </w:t>
+      </w:r>
+      <w:r>
+        <w:rPr>
+          <w:b/>
+        </w:rPr>
+        <w:t>Gateway selbst neu gestartet</w:t>
+      </w:r>
+      <w:r>
+        <w:t xml:space="preserve"> (verzögerter Restart, umging den „Refusing to restart"-Schutz) → Auto-TTS funktioniert live (TTS-Test bestätigt). </w:t>
+      </w:r>
+      <w:r>
+        <w:rPr>
+          <w:b/>
+        </w:rPr>
+        <w:t>Patch gesichert</w:t>
+      </w:r>
+      <w:r>
+        <w:t xml:space="preserve"> als </w:t>
+      </w:r>
+      <w:r>
+        <w:rPr>
+          <w:rFonts w:ascii="Consolas" w:hAnsi="Consolas"/>
+          <w:color w:val="B03060"/>
+          <w:sz w:val="19"/>
+        </w:rPr>
+        <w:t>Hermes/hermes_autotts_selffix_20260616.patch</w:t>
+      </w:r>
+      <w:r>
+        <w:t xml:space="preserve">. ⚠️ </w:t>
+      </w:r>
+      <w:r>
+        <w:rPr>
+          <w:b/>
+        </w:rPr>
+        <w:t>Upstream-Divergenz</w:t>
+      </w:r>
+      <w:r>
+        <w:t xml:space="preserve"> — diese 7 Dateien weichen jetzt vom Nous-Code ab und erschweren künftige </w:t>
+      </w:r>
+      <w:r>
+        <w:rPr>
+          <w:rFonts w:ascii="Consolas" w:hAnsi="Consolas"/>
+          <w:color w:val="B03060"/>
+          <w:sz w:val="19"/>
+        </w:rPr>
+        <w:t>hermes update</w:t>
+      </w:r>
+      <w:r>
+        <w:t xml:space="preserve">s (genau den Desktop-/node-24-Pfad). Vor einem Update: Patch via </w:t>
+      </w:r>
+      <w:r>
+        <w:rPr>
+          <w:rFonts w:ascii="Consolas" w:hAnsi="Consolas"/>
+          <w:color w:val="B03060"/>
+          <w:sz w:val="19"/>
+        </w:rPr>
+        <w:t>git apply</w:t>
+      </w:r>
+      <w:r>
+        <w:t xml:space="preserve"> re-anwenden ODER auf offiziellen Nous-Fix warten + lokal zurückrollen (</w:t>
+      </w:r>
+      <w:r>
+        <w:rPr>
+          <w:rFonts w:ascii="Consolas" w:hAnsi="Consolas"/>
+          <w:color w:val="B03060"/>
+          <w:sz w:val="19"/>
+        </w:rPr>
+        <w:t>git -C …\hermes-agent checkout -- .</w:t>
+      </w:r>
+      <w:r>
+        <w:t>).</w:t>
+      </w:r>
+    </w:p>
+    <w:p>
+      <w:pPr>
+        <w:pStyle w:val="ListBullet"/>
+      </w:pPr>
+      <w:r>
+        <w:rPr>
+          <w:b/>
+        </w:rPr>
         <w:t>Phase 5 — Autonomie:</w:t>
       </w:r>
       <w:r>
@@ -1858,6 +2576,15 @@
       </w:r>
       <w:r>
         <w:t xml:space="preserve"> (personalisierte Ideen-/Prototyp-Vorschläge aus Personenkenntnis, Nordstern-gebunden + Triage; graduierte Vorschläge → Linear/PRD → Claude Code). </w:t>
+      </w:r>
+      <w:r>
+        <w:rPr>
+          <w:b/>
+        </w:rPr>
+        <w:t>Optionaler Auftakt: Desktop-App</w:t>
+      </w:r>
+      <w:r>
+        <w:t xml:space="preserve"> (Befund Phase 4 B) — nur koppeln, wenn die Profiles-/Cron-UI für Multi-Profil/Autonomie konkret gebraucht wird. </w:t>
       </w:r>
       <w:r>
         <w:rPr>
@@ -2296,8 +3023,244 @@
       </w:r>
     </w:p>
     <w:p>
-      <w:r>
-        <w:t>*(Weitere Prompts aus Phase 4–5 werden hier ergänzt, sobald wir sie nutzen.)*</w:t>
+      <w:pPr>
+        <w:pStyle w:val="Heading3"/>
+      </w:pPr>
+      <w:r/>
+      <w:r>
+        <w:t>A.5 Phase 4 — Werkzeuge (Grok-Tool + Skills-Ausmist), wiederverwendbare Befehle</w:t>
+      </w:r>
+    </w:p>
+    <w:p>
+      <w:pPr>
+        <w:ind w:left="360"/>
+      </w:pPr>
+      <w:r>
+        <w:rPr>
+          <w:i/>
+          <w:color w:val="555555"/>
+        </w:rPr>
+      </w:r>
+      <w:r>
+        <w:rPr>
+          <w:i/>
+          <w:color w:val="555555"/>
+        </w:rPr>
+        <w:t xml:space="preserve">Nicht-interaktive </w:t>
+      </w:r>
+      <w:r>
+        <w:rPr>
+          <w:rFonts w:ascii="Consolas" w:hAnsi="Consolas"/>
+          <w:i/>
+          <w:color w:val="555555"/>
+          <w:sz w:val="19"/>
+        </w:rPr>
+        <w:t>hermes</w:t>
+      </w:r>
+      <w:r>
+        <w:rPr>
+          <w:i/>
+          <w:color w:val="555555"/>
+        </w:rPr>
+        <w:t xml:space="preserve">-Checks lassen sich auch ohne Terminal-Neustart fahren, wenn man den Launcher absolut adressiert: </w:t>
+      </w:r>
+      <w:r>
+        <w:rPr>
+          <w:rFonts w:ascii="Consolas" w:hAnsi="Consolas"/>
+          <w:i/>
+          <w:color w:val="555555"/>
+          <w:sz w:val="19"/>
+        </w:rPr>
+        <w:t>C:\Users\manyw\AppData\Local\hermes\hermes-agent\venv\Scripts\hermes.exe</w:t>
+      </w:r>
+      <w:r>
+        <w:rPr>
+          <w:i/>
+          <w:color w:val="555555"/>
+        </w:rPr>
+        <w:t>. Interaktives (OAuth-Browser-Flow) im eigenen Terminal.</w:t>
+      </w:r>
+    </w:p>
+    <w:p>
+      <w:r>
+        <w:rPr>
+          <w:b/>
+        </w:rPr>
+        <w:t>(A) Grok als Tool anbinden (kein API-Key, OAuth):</w:t>
+      </w:r>
+    </w:p>
+    <w:p>
+      <w:pPr>
+        <w:spacing w:after="120"/>
+        <w:ind w:left="240"/>
+      </w:pPr>
+      <w:r>
+        <w:rPr>
+          <w:rFonts w:ascii="Consolas" w:hAnsi="Consolas"/>
+          <w:sz w:val="18"/>
+        </w:rPr>
+        <w:t>hermes auth add xai-oauth        # PKCE-Loopback-OAuth; Browser → autorisieren. SuperGrok/Premium+ nötig. Aendert NICHT das Hauptmodell.</w:t>
+        <w:br/>
+        <w:t>hermes auth status xai-oauth     # erwartet: "logged in"</w:t>
+        <w:br/>
+        <w:t>hermes tools enable x_search     # X-Trend-Scan scharf schalten (nutzt die xai-oauth-Credential, model grok-4.20-reasoning)</w:t>
+        <w:br/>
+        <w:t>hermes tools list                # Verifikation</w:t>
+      </w:r>
+    </w:p>
+    <w:p>
+      <w:r>
+        <w:t xml:space="preserve">*Funktionstest (in Telegram/Hermes):* „Nutze dein X-Search-Tool (Grok): die 3–4 meistdiskutierten Themen rund um KI-Agenten, je mit Link." → muss </w:t>
+      </w:r>
+      <w:r>
+        <w:rPr>
+          <w:rFonts w:ascii="Consolas" w:hAnsi="Consolas"/>
+          <w:color w:val="B03060"/>
+          <w:sz w:val="19"/>
+        </w:rPr>
+        <w:t>🐦 x_search</w:t>
+      </w:r>
+      <w:r>
+        <w:t xml:space="preserve"> feuern + echte x.com-Status-Links liefern. (</w:t>
+      </w:r>
+      <w:r>
+        <w:rPr>
+          <w:rFonts w:ascii="Consolas" w:hAnsi="Consolas"/>
+          <w:color w:val="B03060"/>
+          <w:sz w:val="19"/>
+        </w:rPr>
+        <w:t>video_gen</w:t>
+      </w:r>
+      <w:r>
+        <w:t xml:space="preserve"> braucht zusätzlich einen Provider-Block → erst bei konkretem Bedarf.)</w:t>
+      </w:r>
+    </w:p>
+    <w:p>
+      <w:r>
+        <w:rPr>
+          <w:b/>
+        </w:rPr>
+        <w:t>(B) Tool-/Skill-Status messen + ausmisten:</w:t>
+      </w:r>
+    </w:p>
+    <w:p>
+      <w:pPr>
+        <w:spacing w:after="120"/>
+        <w:ind w:left="240"/>
+      </w:pPr>
+      <w:r>
+        <w:rPr>
+          <w:rFonts w:ascii="Consolas" w:hAnsi="Consolas"/>
+          <w:sz w:val="18"/>
+        </w:rPr>
+        <w:t>hermes prompt-size               # Byte-Breakdown System-Prompt + Tool-Schemas (Baseline/Erfolgsmessung)</w:t>
+        <w:br/>
+        <w:t>hermes tools list                # Toolsets enabled/disabled</w:t>
+        <w:br/>
+        <w:t>hermes skills list               # installierte Skills + Status (Summenzeile: x enabled / y disabled)</w:t>
+        <w:br/>
+        <w:t>hermes skills config             # interaktive TUI zum Einzel-Toggle</w:t>
+      </w:r>
+    </w:p>
+    <w:p>
+      <w:r>
+        <w:rPr>
+          <w:b/>
+        </w:rPr>
+        <w:t>Skills non-interaktiv per Batch deaktivieren</w:t>
+      </w:r>
+      <w:r>
+        <w:t xml:space="preserve"> (TUI schreibt nur die Liste </w:t>
+      </w:r>
+      <w:r>
+        <w:rPr>
+          <w:rFonts w:ascii="Consolas" w:hAnsi="Consolas"/>
+          <w:color w:val="B03060"/>
+          <w:sz w:val="19"/>
+        </w:rPr>
+        <w:t>skills.disabled</w:t>
+      </w:r>
+      <w:r>
+        <w:t xml:space="preserve"> in config.yaml → direkt setzbar):</w:t>
+      </w:r>
+    </w:p>
+    <w:p>
+      <w:pPr>
+        <w:spacing w:after="120"/>
+        <w:ind w:left="240"/>
+      </w:pPr>
+      <w:r>
+        <w:rPr>
+          <w:rFonts w:ascii="Consolas" w:hAnsi="Consolas"/>
+          <w:sz w:val="18"/>
+        </w:rPr>
+        <w:t># venv-Python, cwd = hermes-agent</w:t>
+        <w:br/>
+        <w:t>from hermes_cli.config import load_config</w:t>
+        <w:br/>
+        <w:t>from hermes_cli.skills_config import get_disabled_skills, save_disabled_skills</w:t>
+        <w:br/>
+        <w:t>cfg = load_config()</w:t>
+        <w:br/>
+        <w:t>save_disabled_skills(cfg, set(get_disabled_skills(cfg)) | {"comfyui","yuanbao",...}, platform=None)</w:t>
+      </w:r>
+    </w:p>
+    <w:p>
+      <w:r>
+        <w:t xml:space="preserve">*Danach </w:t>
+      </w:r>
+      <w:r>
+        <w:rPr>
+          <w:rFonts w:ascii="Consolas" w:hAnsi="Consolas"/>
+          <w:color w:val="B03060"/>
+          <w:sz w:val="19"/>
+        </w:rPr>
+        <w:t>hermes gateway restart</w:t>
+      </w:r>
+      <w:r>
+        <w:t>, damit der schlankere Prompt in der laufenden Session greift (oder warten bis zum nächsten Login-Auto-Start). Config-Backup vorher anlegen.*</w:t>
+      </w:r>
+    </w:p>
+    <w:p>
+      <w:r>
+        <w:rPr>
+          <w:b/>
+        </w:rPr>
+        <w:t>Gateway-Restart-Disziplin:</w:t>
+      </w:r>
+      <w:r>
+        <w:t xml:space="preserve"> </w:t>
+      </w:r>
+      <w:r>
+        <w:rPr>
+          <w:rFonts w:ascii="Consolas" w:hAnsi="Consolas"/>
+          <w:color w:val="B03060"/>
+          <w:sz w:val="19"/>
+        </w:rPr>
+        <w:t>hermes gateway restart</w:t>
+      </w:r>
+      <w:r>
+        <w:t xml:space="preserve"> killt den Prozess (kein graceful-Flag; </w:t>
+      </w:r>
+      <w:r>
+        <w:rPr>
+          <w:rFonts w:ascii="Consolas" w:hAnsi="Consolas"/>
+          <w:color w:val="B03060"/>
+          <w:sz w:val="19"/>
+        </w:rPr>
+        <w:t>restart_drain_timeout: 180</w:t>
+      </w:r>
+      <w:r>
+        <w:t xml:space="preserve"> lässt laufende Arbeit nur bis 180 s abfließen). </w:t>
+      </w:r>
+      <w:r>
+        <w:rPr>
+          <w:b/>
+        </w:rPr>
+        <w:t>Nicht</w:t>
+      </w:r>
+      <w:r>
+        <w:t xml:space="preserve"> mitten in eine laufende Agent-Aufgabe restarten — abwarten oder den nächsten Login-Auto-Start nutzen (Config-Änderungen sind schon persistent).</w:t>
       </w:r>
     </w:p>
     <w:p>

</xml_diff>

<commit_message>
TTS-Test-Caveat: Auto-TTS-Mechanik greift, deutsche Stimme + echte Antwort noch offen
Test-Antwort war zufaellig eine englische Rate-Limit-Meldung -> Sprachnachricht englisch; deutsche Stimme (de-DE-Florian) + echte inhaltliche Antwort noch zu verifizieren (offen bis ChatGPT-Plus-Limit-Reset).

Co-Authored-By: Claude Opus 4.8 (1M context) <noreply@anthropic.com>
</commit_message>
<xml_diff>
--- a/Hermes/Hermes-Setup Doku 15062026.docx
+++ b/Hermes/Hermes-Setup Doku 15062026.docx
@@ -2490,7 +2490,43 @@
         <w:t>Gateway selbst neu gestartet</w:t>
       </w:r>
       <w:r>
-        <w:t xml:space="preserve"> (verzögerter Restart, umging den „Refusing to restart"-Schutz) → Auto-TTS funktioniert live (TTS-Test bestätigt). </w:t>
+        <w:t xml:space="preserve"> (verzögerter Restart, umging den „Refusing to restart"-Schutz) → Auto-TTS-</w:t>
+      </w:r>
+      <w:r>
+        <w:rPr>
+          <w:b/>
+        </w:rPr>
+        <w:t>Mechanik</w:t>
+      </w:r>
+      <w:r>
+        <w:t xml:space="preserve"> greift live (Text-Antwort kam mit Sprachnachricht). </w:t>
+      </w:r>
+      <w:r>
+        <w:rPr>
+          <w:b/>
+        </w:rPr>
+        <w:t>Caveat 2026-06-16:</w:t>
+      </w:r>
+      <w:r>
+        <w:t xml:space="preserve"> die Test-Antwort war zufällig eine </w:t>
+      </w:r>
+      <w:r>
+        <w:rPr>
+          <w:b/>
+        </w:rPr>
+        <w:t>englische Rate-Limit-Meldung</w:t>
+      </w:r>
+      <w:r>
+        <w:t xml:space="preserve"> → Sprachnachricht englisch; </w:t>
+      </w:r>
+      <w:r>
+        <w:rPr>
+          <w:b/>
+        </w:rPr>
+        <w:t>deutsche Stimme (de-DE-Florian) + echte inhaltliche Antwort sind noch zu verifizieren</w:t>
+      </w:r>
+      <w:r>
+        <w:t xml:space="preserve"> (offen bis ChatGPT-Plus-Limit-Reset). </w:t>
       </w:r>
       <w:r>
         <w:rPr>

</xml_diff>

<commit_message>
Plan-Korrektur: Opus-Orchestrator nur via API-Key (Agent-SDK-Credit deckt Hermes NICHT)
Recherche 2026-06-16 (claude-code-guide): Agent-SDK-Credit (Max5x ~100/Max20x ~200 USD/Mo) gilt nur fuer offizielles Claude Agent SDK / claude -p / Claude Code, nicht fuer Dritt-Agents wie Hermes (Abo-OAuth = nicht unterstuetzt/ToS-fragil, Issues #12905/#21107). Claude in Hermes nur via API-Key (Pay-as-you-go); low-volume-Orchestrator ~10-40 USD/Mo. Opus-via-Abo-OAuth verworfen. Doku Abschnitt 0 + Lessons korrigiert.

Co-Authored-By: Claude Opus 4.8 (1M context) <noreply@anthropic.com>
</commit_message>
<xml_diff>
--- a/Hermes/Hermes-Setup Doku 15062026.docx
+++ b/Hermes/Hermes-Setup Doku 15062026.docx
@@ -111,10 +111,78 @@
         <w:rPr>
           <w:b/>
         </w:rPr>
-        <w:t>Opus 4.8 später als zweites Orchestrator-Profil</w:t>
-      </w:r>
-      <w:r>
-        <w:t xml:space="preserve"> via SDK-Credit — erst nach Claim + Verifikation, dass die Nutzung wirklich den Credit zieht.</w:t>
+        <w:t>Opus 4.8 ggf. später als zweites Orchestrator-Profil.</w:t>
+      </w:r>
+    </w:p>
+    <w:p>
+      <w:pPr>
+        <w:ind w:left="360"/>
+      </w:pPr>
+      <w:r>
+        <w:rPr>
+          <w:i/>
+          <w:color w:val="555555"/>
+        </w:rPr>
+      </w:r>
+      <w:r>
+        <w:rPr>
+          <w:b/>
+          <w:i/>
+          <w:color w:val="555555"/>
+        </w:rPr>
+        <w:t>KORREKTUR 2026-06-16 (Recherche):</w:t>
+      </w:r>
+      <w:r>
+        <w:rPr>
+          <w:i/>
+          <w:color w:val="555555"/>
+        </w:rPr>
+        <w:t xml:space="preserve"> Die Annahme „Opus gratis über den Agent-SDK-Credit" war falsch. </w:t>
+      </w:r>
+      <w:r>
+        <w:rPr>
+          <w:b/>
+          <w:i/>
+          <w:color w:val="555555"/>
+        </w:rPr>
+        <w:t>Der Agent-SDK-Credit (Max5x ~$100/Mo, Max20x ~$200/Mo) deckt Hermes NICHT</w:t>
+      </w:r>
+      <w:r>
+        <w:rPr>
+          <w:i/>
+          <w:color w:val="555555"/>
+        </w:rPr>
+        <w:t xml:space="preserve"> — er gilt nur fürs </w:t>
+      </w:r>
+      <w:r>
+        <w:rPr>
+          <w:b/>
+          <w:i/>
+          <w:color w:val="555555"/>
+        </w:rPr>
+        <w:t>offizielle Claude Agent SDK / `claude -p` / Claude Code</w:t>
+      </w:r>
+      <w:r>
+        <w:rPr>
+          <w:i/>
+          <w:color w:val="555555"/>
+        </w:rPr>
+        <w:t xml:space="preserve">, nicht für Dritt-Agents wie Hermes (Abo-OAuth „als Claude Code" = nicht unterstützt, ToS-fragil, Routing-Issues #12905/#21107 offen). </w:t>
+      </w:r>
+      <w:r>
+        <w:rPr>
+          <w:b/>
+          <w:i/>
+          <w:color w:val="555555"/>
+        </w:rPr>
+        <w:t>Claude in Hermes geht zuverlässig nur via API-Key (Pay-as-you-go);</w:t>
+      </w:r>
+      <w:r>
+        <w:rPr>
+          <w:i/>
+          <w:color w:val="555555"/>
+        </w:rPr>
+        <w:t xml:space="preserve"> für ein *low-volume* Orchestrator-Profil aber günstig (~$10–40/Mo). Opus-via-Abo-OAuth verworfen; ob Claude überhaupt dazukommt → später entscheiden. Rate-Limit-Transparenz Claude ≈ OpenAI.</w:t>
       </w:r>
     </w:p>
     <w:p>
@@ -1242,10 +1310,19 @@
         <w:rPr>
           <w:b/>
         </w:rPr>
-        <w:t>Opus-4.8-Orchestrator-Profil</w:t>
-      </w:r>
-      <w:r>
-        <w:t xml:space="preserve"> kommt später via Agent-SDK-Credit — erst nach Claim + Verifikation (Anthropic-OAuth = raue Ecke, siehe Warnblock in HERMES_SETUP.md).</w:t>
+        <w:t>Opus-4.8-Orchestrator-Profil:</w:t>
+      </w:r>
+      <w:r>
+        <w:t xml:space="preserve"> ginge </w:t>
+      </w:r>
+      <w:r>
+        <w:rPr>
+          <w:b/>
+        </w:rPr>
+        <w:t>nur via API-Key (Pay-as-you-go)</w:t>
+      </w:r>
+      <w:r>
+        <w:t>, NICHT via Agent-SDK-Credit (der deckt nur das offizielle Claude Agent SDK / Claude Code, nicht Dritt-Agents wie Hermes; Abo-OAuth = nicht unterstützt/ToS-fragil — Recherche 2026-06-16, siehe Korrektur-Block Abschnitt 0). Für low-volume-Orchestrator (Brain) günstig (~$10–40/Mo); ob überhaupt → später entscheiden.</w:t>
       </w:r>
     </w:p>
     <w:p>

</xml_diff>